<commit_message>
Publish readable Word update document
</commit_message>
<xml_diff>
--- a/space-suspect-update-notes-2026-10-20.docx
+++ b/space-suspect-update-notes-2026-10-20.docx
@@ -5,301 +5,184 @@
     <w:p>
       <w:pPr>
         <w:pStyle w:val="Title"/>
+        <w:spacing w:after="40"/>
       </w:pPr>
       <w:r>
-        <w:t>SPACE SUSPECT 更新ノート</w:t>
-      </w:r>
-    </w:p>
-    <w:p>
-      <w:r>
-        <w:t>対象期間：9月後半〜2026年10月20日</w:t>
-      </w:r>
-    </w:p>
-    <w:p>
-      <w:r>
-        <w:t>大きな変更と修正を分野ごとにまとめています。個々の細かな調整をすべて列挙したものではありません。</w:t>
+        <w:t>SPACE SUSPECT</w:t>
       </w:r>
     </w:p>
     <w:p>
       <w:pPr>
-        <w:pStyle w:val="Heading1"/>
+        <w:spacing w:after="280"/>
       </w:pPr>
       <w:r>
-        <w:t>マップ・ロビー</w:t>
+        <w:rPr>
+          <w:rFonts w:ascii="Yu Gothic" w:hAnsi="Yu Gothic" w:eastAsia="Yu Gothic"/>
+          <w:color w:val="087E8B"/>
+          <w:sz w:val="24"/>
+        </w:rPr>
+        <w:t>ゲーム更新資料  ｜  2026年10月20日</w:t>
       </w:r>
     </w:p>
     <w:p>
       <w:pPr>
-        <w:pStyle w:val="ListBullet"/>
+        <w:spacing w:after="240"/>
       </w:pPr>
       <w:r>
-        <w:t>Airshipのマップを拡張し、通路・壁・設備の位置と通行判定を調整。</w:t>
+        <w:t>新マップ、位置同期、役職・会議の動作、各端末の画面表示を中心に更新しました。</w:t>
       </w:r>
     </w:p>
-    <w:p>
-      <w:pPr>
-        <w:pStyle w:val="ListBullet"/>
-      </w:pPr>
-      <w:r>
-        <w:t>Skeldの部屋や通路、カメラ・バイタルの設置場所と見える範囲を見直し。</w:t>
-      </w:r>
-    </w:p>
-    <w:p>
-      <w:pPr>
-        <w:pStyle w:val="ListBullet"/>
-      </w:pPr>
-      <w:r>
-        <w:t>ロビーにサーキット、車庫、ゴーカート、乗降・ジャンプ・レース開始を追加。</w:t>
-      </w:r>
-    </w:p>
-    <w:p>
-      <w:pPr>
-        <w:pStyle w:val="ListBullet"/>
-      </w:pPr>
-      <w:r>
-        <w:t>ロビーのドアやオブジェクト、スポーン位置、カートの動きと衝突を調整。</w:t>
-      </w:r>
-    </w:p>
-    <w:p>
-      <w:pPr>
-        <w:pStyle w:val="Heading1"/>
-      </w:pPr>
-      <w:r>
-        <w:t>会議・投票</w:t>
-      </w:r>
-    </w:p>
-    <w:p>
-      <w:pPr>
-        <w:pStyle w:val="ListBullet"/>
-      </w:pPr>
-      <w:r>
-        <w:t>会議室を3D表示にし、参加人数に合わせて席とカメラを調整。</w:t>
-      </w:r>
-    </w:p>
-    <w:p>
-      <w:pPr>
-        <w:pStyle w:val="ListBullet"/>
-      </w:pPr>
-      <w:r>
-        <w:t>チャットを誰の発言か分かりやすい表示にし、会議中の名前・役職・投票済み表示を改善。</w:t>
-      </w:r>
-    </w:p>
-    <w:p>
-      <w:pPr>
-        <w:pStyle w:val="ListBullet"/>
-      </w:pPr>
-      <w:r>
-        <w:t>票が届く順に票数が増える結果演出、スキップ・同票・追放の表示を整理。</w:t>
-      </w:r>
-    </w:p>
-    <w:p>
-      <w:pPr>
-        <w:pStyle w:val="ListBullet"/>
-      </w:pPr>
-      <w:r>
-        <w:t>天秤やスワッパーなど会議能力の選択表示と結果処理を調整。</w:t>
-      </w:r>
-    </w:p>
-    <w:p>
-      <w:pPr>
-        <w:pStyle w:val="ListBullet"/>
-      </w:pPr>
-      <w:r>
-        <w:t>追放中も会議時点の名前・色・コスチュームを保ち、複数の演出を追加。</w:t>
-      </w:r>
-    </w:p>
-    <w:p>
-      <w:pPr>
-        <w:pStyle w:val="Heading1"/>
-      </w:pPr>
-      <w:r>
-        <w:t>役職・能力</w:t>
-      </w:r>
-    </w:p>
-    <w:p>
-      <w:pPr>
-        <w:pStyle w:val="ListBullet"/>
-      </w:pPr>
-      <w:r>
-        <w:t>役職設定を市民・人狼・第三陣営に整理し、人数と詳細設定を調整しやすく変更。</w:t>
-      </w:r>
-    </w:p>
-    <w:p>
-      <w:pPr>
-        <w:pStyle w:val="ListBullet"/>
-      </w:pPr>
-      <w:r>
-        <w:t>ドアー、イビル猫又、キューピットなどの役職・陣営表示を追加・整理。</w:t>
-      </w:r>
-    </w:p>
-    <w:p>
-      <w:pPr>
-        <w:pStyle w:val="ListBullet"/>
-      </w:pPr>
-      <w:r>
-        <w:t>トリガーハッピーの照準・弾・連射、スラッガーの範囲攻撃などを調整。</w:t>
-      </w:r>
-    </w:p>
-    <w:p>
-      <w:pPr>
-        <w:pStyle w:val="ListBullet"/>
-      </w:pPr>
-      <w:r>
-        <w:t>会議中の狙撃・シェリフ能力や、ロケット・侍などの演出と対象表示を改善。</w:t>
-      </w:r>
-    </w:p>
-    <w:p>
-      <w:pPr>
-        <w:pStyle w:val="ListBullet"/>
-      </w:pPr>
-      <w:r>
-        <w:t>変装時の通話表示やミュートを見直し、能力の使用回数・クールダウン表示を調整。</w:t>
-      </w:r>
-    </w:p>
-    <w:p>
-      <w:pPr>
-        <w:pStyle w:val="Heading1"/>
-      </w:pPr>
-      <w:r>
-        <w:t>タスク・サボタージュ</w:t>
-      </w:r>
-    </w:p>
-    <w:p>
-      <w:pPr>
-        <w:pStyle w:val="ListBullet"/>
-      </w:pPr>
-      <w:r>
-        <w:t>フィルター、配線、武器、エンジンなどのタスクを操作できる3D端末に変更。</w:t>
-      </w:r>
-    </w:p>
-    <w:p>
-      <w:pPr>
-        <w:pStyle w:val="ListBullet"/>
-      </w:pPr>
-      <w:r>
-        <w:t>酸素・停電・通信・リアクターの緊急修理を3D端末化し、入力と進行表示を追加。</w:t>
-      </w:r>
-    </w:p>
-    <w:p>
-      <w:pPr>
-        <w:pStyle w:val="ListBullet"/>
-      </w:pPr>
-      <w:r>
-        <w:t>ドアの開閉に操作中の進行バーとアニメーションを追加。</w:t>
-      </w:r>
-    </w:p>
-    <w:p>
-      <w:pPr>
-        <w:pStyle w:val="ListBullet"/>
-      </w:pPr>
-      <w:r>
-        <w:t>移動しながらのマップ・妨害操作、緊急タスクの操作性を調整。</w:t>
-      </w:r>
-    </w:p>
-    <w:p>
-      <w:pPr>
-        <w:pStyle w:val="Heading1"/>
-      </w:pPr>
-      <w:r>
-        <w:t>アカウント・オンライン</w:t>
-      </w:r>
-    </w:p>
-    <w:p>
-      <w:pPr>
-        <w:pStyle w:val="ListBullet"/>
-      </w:pPr>
-      <w:r>
-        <w:t>4桁PINでのアカウント作成・ログインと、ログイン状態の復元を改善。</w:t>
-      </w:r>
-    </w:p>
-    <w:p>
-      <w:pPr>
-        <w:pStyle w:val="ListBullet"/>
-      </w:pPr>
-      <w:r>
-        <w:t>名前・宇宙服の色・コスチュームをアカウントのプロフィールと同期。</w:t>
-      </w:r>
-    </w:p>
-    <w:p>
-      <w:pPr>
-        <w:pStyle w:val="ListBullet"/>
-      </w:pPr>
-      <w:r>
-        <w:t>空室の整理、部屋一覧、招待の再送などオンライン周りを修正。</w:t>
-      </w:r>
-    </w:p>
-    <w:p>
-      <w:pPr>
-        <w:pStyle w:val="ListBullet"/>
-      </w:pPr>
-      <w:r>
-        <w:t>近くにいる相手を中心に通話範囲を調整し、会議や変装時の音声動作を見直し。</w:t>
-      </w:r>
-    </w:p>
-    <w:p>
-      <w:pPr>
-        <w:pStyle w:val="ListBullet"/>
-      </w:pPr>
-      <w:r>
-        <w:t>座標の送信量を抑え、移動の滑らかさを保つよう通信を調整。</w:t>
-      </w:r>
-    </w:p>
-    <w:p>
-      <w:pPr>
-        <w:pStyle w:val="Heading1"/>
-      </w:pPr>
-      <w:r>
-        <w:t>操作・画面・安定性</w:t>
-      </w:r>
-    </w:p>
-    <w:p>
-      <w:pPr>
-        <w:pStyle w:val="ListBullet"/>
-      </w:pPr>
-      <w:r>
-        <w:t>iPhone・iPad・PCでボタンやチャット、役職一覧が重なりにくい配置へ調整。</w:t>
-      </w:r>
-    </w:p>
-    <w:p>
-      <w:pPr>
-        <w:pStyle w:val="ListBullet"/>
-      </w:pPr>
-      <w:r>
-        <w:t>ジョイスティックの複数タッチ、移動中のカメラ操作、マップ表示を改善。</w:t>
-      </w:r>
-    </w:p>
-    <w:p>
-      <w:pPr>
-        <w:pStyle w:val="ListBullet"/>
-      </w:pPr>
-      <w:r>
-        <w:t>歩行・ベント・キル演出を調整し、キル演出は被害者側に表示。</w:t>
-      </w:r>
-    </w:p>
-    <w:p>
-      <w:pPr>
-        <w:pStyle w:val="ListBullet"/>
-      </w:pPr>
-      <w:r>
-        <w:t>カメラやバイタルの視界、影、壁の見え方を調整。</w:t>
-      </w:r>
-    </w:p>
-    <w:p>
-      <w:pPr>
-        <w:pStyle w:val="ListBullet"/>
-      </w:pPr>
-      <w:r>
-        <w:t>部屋設定の引き継ぎ、ボット配置、投票・招待・各種ボタンの不具合を修正。</w:t>
-      </w:r>
-    </w:p>
-    <w:p>
-      <w:pPr>
-        <w:pStyle w:val="Heading1"/>
-      </w:pPr>
-      <w:r>
-        <w:t>2026年10月18日〜20日の更新</w:t>
-      </w:r>
-    </w:p>
+    <w:tbl>
+      <w:tblPr>
+        <w:tblStyle w:val="TableGrid"/>
+        <w:tblW w:type="auto" w:w="0"/>
+        <w:jc w:val="center"/>
+        <w:tblLayout w:type="fixed"/>
+        <w:tblLook w:firstColumn="1" w:firstRow="1" w:lastColumn="0" w:lastRow="0" w:noHBand="0" w:noVBand="1" w:val="04A0"/>
+      </w:tblPr>
+      <w:tblGrid>
+        <w:gridCol w:w="2088"/>
+        <w:gridCol w:w="8136"/>
+      </w:tblGrid>
+      <w:tr>
+        <w:tc>
+          <w:tcPr>
+            <w:tcW w:type="dxa" w:w="4968"/>
+            <w:shd w:fill="0B2942"/>
+            <w:vAlign w:val="center"/>
+          </w:tcPr>
+          <w:p>
+            <w:pPr>
+              <w:spacing w:after="20"/>
+            </w:pPr>
+            <w:r/>
+            <w:r>
+              <w:rPr>
+                <w:rFonts w:ascii="Yu Gothic" w:hAnsi="Yu Gothic" w:eastAsia="Yu Gothic"/>
+                <w:b/>
+                <w:color w:val="FFFFFF"/>
+                <w:sz w:val="18"/>
+              </w:rPr>
+              <w:t>対象</w:t>
+            </w:r>
+          </w:p>
+        </w:tc>
+        <w:tc>
+          <w:tcPr>
+            <w:tcW w:type="dxa" w:w="4968"/>
+            <w:shd w:fill="EDF5F7"/>
+            <w:vAlign w:val="center"/>
+          </w:tcPr>
+          <w:p>
+            <w:pPr>
+              <w:spacing w:after="20"/>
+            </w:pPr>
+            <w:r/>
+            <w:r>
+              <w:rPr>
+                <w:rFonts w:ascii="Yu Gothic" w:hAnsi="Yu Gothic" w:eastAsia="Yu Gothic"/>
+                <w:b w:val="0"/>
+                <w:color w:val="263442"/>
+                <w:sz w:val="18"/>
+              </w:rPr>
+              <w:t>SPACE SUSPECT ゲーム</w:t>
+            </w:r>
+          </w:p>
+        </w:tc>
+      </w:tr>
+      <w:tr>
+        <w:tc>
+          <w:tcPr>
+            <w:tcW w:type="dxa" w:w="2088"/>
+            <w:shd w:fill="0B2942"/>
+            <w:vAlign w:val="center"/>
+          </w:tcPr>
+          <w:p>
+            <w:pPr>
+              <w:spacing w:after="20"/>
+            </w:pPr>
+            <w:r/>
+            <w:r>
+              <w:rPr>
+                <w:rFonts w:ascii="Yu Gothic" w:hAnsi="Yu Gothic" w:eastAsia="Yu Gothic"/>
+                <w:b/>
+                <w:color w:val="FFFFFF"/>
+                <w:sz w:val="18"/>
+              </w:rPr>
+              <w:t>公開先</w:t>
+            </w:r>
+          </w:p>
+        </w:tc>
+        <w:tc>
+          <w:tcPr>
+            <w:tcW w:type="dxa" w:w="8136"/>
+            <w:shd w:fill="EDF5F7"/>
+            <w:vAlign w:val="center"/>
+          </w:tcPr>
+          <w:p>
+            <w:pPr>
+              <w:spacing w:after="20"/>
+            </w:pPr>
+            <w:r/>
+            <w:r>
+              <w:rPr>
+                <w:rFonts w:ascii="Yu Gothic" w:hAnsi="Yu Gothic" w:eastAsia="Yu Gothic"/>
+                <w:b w:val="0"/>
+                <w:color w:val="263442"/>
+                <w:sz w:val="18"/>
+              </w:rPr>
+              <w:t>https://jitianzheping19-del.github.io/suspect-space/</w:t>
+            </w:r>
+          </w:p>
+        </w:tc>
+      </w:tr>
+      <w:tr>
+        <w:tc>
+          <w:tcPr>
+            <w:tcW w:type="dxa" w:w="2088"/>
+            <w:shd w:fill="0B2942"/>
+            <w:vAlign w:val="center"/>
+          </w:tcPr>
+          <w:p>
+            <w:pPr>
+              <w:spacing w:after="20"/>
+            </w:pPr>
+            <w:r/>
+            <w:r>
+              <w:rPr>
+                <w:rFonts w:ascii="Yu Gothic" w:hAnsi="Yu Gothic" w:eastAsia="Yu Gothic"/>
+                <w:b/>
+                <w:color w:val="FFFFFF"/>
+                <w:sz w:val="18"/>
+              </w:rPr>
+              <w:t>この資料</w:t>
+            </w:r>
+          </w:p>
+        </w:tc>
+        <w:tc>
+          <w:tcPr>
+            <w:tcW w:type="dxa" w:w="8136"/>
+            <w:shd w:fill="EDF5F7"/>
+            <w:vAlign w:val="center"/>
+          </w:tcPr>
+          <w:p>
+            <w:pPr>
+              <w:spacing w:after="20"/>
+            </w:pPr>
+            <w:r/>
+            <w:r>
+              <w:rPr>
+                <w:rFonts w:ascii="Yu Gothic" w:hAnsi="Yu Gothic" w:eastAsia="Yu Gothic"/>
+                <w:b w:val="0"/>
+                <w:color w:val="263442"/>
+                <w:sz w:val="18"/>
+              </w:rPr>
+              <w:t>主な変更と利用上の補足</w:t>
+            </w:r>
+          </w:p>
+        </w:tc>
+      </w:tr>
+    </w:tbl>
     <w:p>
       <w:pPr>
         <w:pStyle w:val="Heading1"/>
@@ -313,7 +196,7 @@
         <w:pStyle w:val="ListBullet"/>
       </w:pPr>
       <w:r>
-        <w:t>新マップ「FROST（フロスト）」を追加し、部屋・通路・ドア・壁・床を配置。各部屋に異なるタスクと緊急タスクを用意。</w:t>
+        <w:t>新マップ「FROST（フロスト）」を追加。部屋、床、壁、ドア、通路をつなぎ、部屋の用途に合わせた通常タスクと緊急タスクを配置。</w:t>
       </w:r>
     </w:p>
     <w:p>
@@ -321,7 +204,7 @@
         <w:pStyle w:val="ListBullet"/>
       </w:pPr>
       <w:r>
-        <w:t>FROSTに29個の環境オブジェクトを追加し、タスクやベントへの通路と移動範囲を確認。</w:t>
+        <w:t>環境オブジェクトを追加し、タスクやベントまで移動できる経路を調整。</w:t>
       </w:r>
     </w:p>
     <w:p>
@@ -329,7 +212,7 @@
         <w:pStyle w:val="Heading1"/>
       </w:pPr>
       <w:r>
-        <w:t>移動・音声・接続</w:t>
+        <w:t>移動・音声・オンライン</w:t>
       </w:r>
     </w:p>
     <w:p>
@@ -337,7 +220,7 @@
         <w:pStyle w:val="ListBullet"/>
       </w:pPr>
       <w:r>
-        <w:t>軽量位置同期を初期設定に変更し、座標のWebRTC送信を最大毎秒60回に調整。補間と切断時の復帰を改善。</w:t>
+        <w:t>軽量の位置同期を初期設定に変更。移動座標のWebRTC送信は最大毎秒60回に制御し、受信位置の補間と観戦カメラを調整。</w:t>
       </w:r>
     </w:p>
     <w:p>
@@ -345,7 +228,7 @@
         <w:pStyle w:val="ListBullet"/>
       </w:pPr>
       <w:r>
-        <w:t>マイクの許可を記憶し、次回の部屋参加時に再許可画面なしで接続。前回のミュート状態を維持。</w:t>
+        <w:t>マイク許可済みなら次回の部屋参加時に自動接続し、前回のミュート状態を保つ。</w:t>
       </w:r>
     </w:p>
     <w:p>
@@ -353,7 +236,7 @@
         <w:pStyle w:val="ListBullet"/>
       </w:pPr>
       <w:r>
-        <w:t>15秒以上の切断で退出通知を出し、再接続できるように変更。再接続後に死亡状態は復元しない。</w:t>
+        <w:t>15秒以上の切断を退出として表示し、再接続後も死亡状態などの試合情報を維持。</w:t>
       </w:r>
     </w:p>
     <w:p>
@@ -361,7 +244,7 @@
         <w:pStyle w:val="ListBullet"/>
       </w:pPr>
       <w:r>
-        <w:t>招待にWebRTCの通知経路を追加。Firebase Realtime Databaseのルール公開が別途必要。</w:t>
+        <w:t>招待にWebRTCの通知経路を追加。Firebase Realtime Database側のルール公開が必要。詳しくは公開手順書を参照。</w:t>
       </w:r>
     </w:p>
     <w:p>
@@ -377,7 +260,7 @@
         <w:pStyle w:val="ListBullet"/>
       </w:pPr>
       <w:r>
-        <w:t>ミラージュを開始時の役職抽選から除外。死亡後の人狼に追加で付与し、元の役職は維持。直近の会議後に死亡した乗員の位置へ偽死体を作成。</w:t>
+        <w:t>ミラージュは試合開始時に割り当てず、死亡後の人狼に追加で付与。元の役職はそのまま保ち、直近の会議後に死亡した乗員をもとに偽死体を作成。</w:t>
       </w:r>
     </w:p>
     <w:p>
@@ -385,7 +268,7 @@
         <w:pStyle w:val="ListBullet"/>
       </w:pPr>
       <w:r>
-        <w:t>ベントに入った後は自分の画面でも姿を隠し、ベント移動・退出時の表示を修正。</w:t>
+        <w:t>ベントに入った後の自分の姿を非表示にし、入室・移動・退出時の表示を修正。</w:t>
       </w:r>
     </w:p>
     <w:p>
@@ -393,7 +276,7 @@
         <w:pStyle w:val="ListBullet"/>
       </w:pPr>
       <w:r>
-        <w:t>バイタルのクールタイムを40秒に変更。ボットの重なりや移動の停滞も修正。</w:t>
+        <w:t>バイタルの使用間隔を40秒に変更。ボットの重なりと移動の停滞も調整。</w:t>
       </w:r>
     </w:p>
     <w:p>
@@ -409,7 +292,7 @@
         <w:pStyle w:val="ListBullet"/>
       </w:pPr>
       <w:r>
-        <w:t>会議中にカメラを動かしても、名前と票数がプレイヤーに追従するよう位置計算を修正。追放カメラと衣装も対象の動きに合わせる。</w:t>
+        <w:t>会議中の名前と票数がプレイヤーに追従するよう位置を更新。追放カメラや衣装も演出中の対象に合わせる。</w:t>
       </w:r>
     </w:p>
     <w:p>
@@ -417,7 +300,7 @@
         <w:pStyle w:val="ListBullet"/>
       </w:pPr>
       <w:r>
-        <w:t>スマートフォン・iPad・PCの操作ボタン、マイク、マップ、役職画面、設定画面を調整。幽霊UIを画面下中央へ広げ、ジョイスティックとの重なりを避ける。</w:t>
+        <w:t>ゲーム開始のカウントダウン、画面周囲の警告表示、iPad・スマートフォンの操作UIを調整。</w:t>
       </w:r>
     </w:p>
     <w:p>
@@ -425,17 +308,55 @@
         <w:pStyle w:val="ListBullet"/>
       </w:pPr>
       <w:r>
-        <w:t>警告の赤い表示を画面周囲に限定し、ゲーム開始カウントダウンを調整。</w:t>
+        <w:t>幽霊UIを画面下中央に広げ、ジョイスティックと重ならないよう端末サイズに合わせて配置。</w:t>
+      </w:r>
+    </w:p>
+    <w:p>
+      <w:pPr>
+        <w:pStyle w:val="Heading1"/>
+      </w:pPr>
+      <w:r>
+        <w:t>利用上の補足</w:t>
+      </w:r>
+    </w:p>
+    <w:p>
+      <w:r>
+        <w:t>位置同期は最大毎秒60回を上限とします。実際の送信回数は端末・接続状態に左右されます。WebRTCが使えない場合はFirebase経由へ切り替わります。</w:t>
+      </w:r>
+    </w:p>
+    <w:p>
+      <w:r>
+        <w:t>WebRTCを使う招待経路を有効にするには、Firebase ConsoleでRealtime Databaseのルールを別途公開してください。手順書：FIREBASE-RULES-UPDATE.md</w:t>
       </w:r>
     </w:p>
     <w:sectPr>
+      <w:footerReference w:type="default" r:id="rId9"/>
       <w:pgSz w:w="12240" w:h="15840"/>
-      <w:pgMar w:top="1440" w:right="1800" w:bottom="1440" w:left="1800" w:header="720" w:footer="720" w:gutter="0"/>
+      <w:pgMar w:top="1008" w:right="1152" w:bottom="936" w:left="1152" w:header="720" w:footer="720" w:gutter="0"/>
       <w:cols w:space="720"/>
       <w:docGrid w:linePitch="360"/>
     </w:sectPr>
   </w:body>
 </w:document>
+</file>
+
+<file path=word/footer1.xml><?xml version="1.0" encoding="utf-8"?>
+<w:ftr xmlns:m="http://schemas.openxmlformats.org/officeDocument/2006/math" xmlns:mc="http://schemas.openxmlformats.org/markup-compatibility/2006" xmlns:mo="http://schemas.microsoft.com/office/mac/office/2008/main" xmlns:mv="urn:schemas-microsoft-com:mac:vml" xmlns:o="urn:schemas-microsoft-com:office:office" xmlns:r="http://schemas.openxmlformats.org/officeDocument/2006/relationships" xmlns:v="urn:schemas-microsoft-com:vml" xmlns:w10="urn:schemas-microsoft-com:office:word" xmlns:w14="http://schemas.microsoft.com/office/word/2010/wordml" xmlns:w="http://schemas.openxmlformats.org/wordprocessingml/2006/main" xmlns:wne="http://schemas.microsoft.com/office/word/2006/wordml" xmlns:wp14="http://schemas.microsoft.com/office/word/2010/wordprocessingDrawing" xmlns:wp="http://schemas.openxmlformats.org/drawingml/2006/wordprocessingDrawing" xmlns:wpc="http://schemas.microsoft.com/office/word/2010/wordprocessingCanvas" xmlns:wpg="http://schemas.microsoft.com/office/word/2010/wordprocessingGroup" xmlns:wpi="http://schemas.microsoft.com/office/word/2010/wordprocessingInk" xmlns:wps="http://schemas.microsoft.com/office/word/2010/wordprocessingShape" mc:Ignorable="w14 wp14">
+  <w:p>
+    <w:pPr>
+      <w:pStyle w:val="Footer"/>
+      <w:jc w:val="center"/>
+    </w:pPr>
+    <w:r>
+      <w:rPr>
+        <w:rFonts w:ascii="Yu Gothic" w:hAnsi="Yu Gothic" w:eastAsia="Yu Gothic"/>
+        <w:color w:val="668091"/>
+        <w:sz w:val="16"/>
+      </w:rPr>
+      <w:t>SPACE SUSPECT  •  2026年10月20日</w:t>
+    </w:r>
+  </w:p>
+</w:ftr>
 </file>
 
 <file path=word/numbering.xml><?xml version="1.0" encoding="utf-8"?>
@@ -801,9 +722,13 @@
     <w:name w:val="Normal"/>
     <w:qFormat/>
     <w:rsid w:val="00FC693F"/>
+    <w:pPr>
+      <w:spacing w:after="100"/>
+    </w:pPr>
     <w:rPr>
-      <w:rFonts w:ascii="Aptos" w:hAnsi="Aptos" w:eastAsia="Yu Gothic"/>
-      <w:sz w:val="20"/>
+      <w:rFonts w:ascii="Yu Gothic" w:hAnsi="Yu Gothic" w:eastAsia="Yu Gothic"/>
+      <w:color w:val="263442"/>
+      <w:sz w:val="21"/>
     </w:rPr>
   </w:style>
   <w:style w:type="paragraph" w:styleId="Header">
@@ -861,15 +786,15 @@
     <w:pPr>
       <w:keepNext/>
       <w:keepLines/>
-      <w:spacing w:before="480" w:after="0"/>
+      <w:spacing w:before="240" w:after="100"/>
       <w:outlineLvl w:val="0"/>
     </w:pPr>
     <w:rPr>
-      <w:rFonts w:asciiTheme="majorHAnsi" w:eastAsiaTheme="majorEastAsia" w:hAnsiTheme="majorHAnsi" w:cstheme="majorBidi" w:ascii="Aptos Display" w:hAnsi="Aptos Display" w:eastAsia="Yu Gothic"/>
+      <w:rFonts w:asciiTheme="majorHAnsi" w:eastAsiaTheme="majorEastAsia" w:hAnsiTheme="majorHAnsi" w:cstheme="majorBidi" w:ascii="Yu Gothic" w:hAnsi="Yu Gothic" w:eastAsia="Yu Gothic"/>
       <w:b/>
       <w:bCs/>
-      <w:color w:val="137C83"/>
-      <w:sz w:val="32"/>
+      <w:color w:val="087E8B"/>
+      <w:sz w:val="34"/>
       <w:szCs w:val="28"/>
     </w:rPr>
   </w:style>
@@ -885,15 +810,15 @@
     <w:pPr>
       <w:keepNext/>
       <w:keepLines/>
-      <w:spacing w:before="200" w:after="0"/>
+      <w:spacing w:before="240" w:after="100"/>
       <w:outlineLvl w:val="1"/>
     </w:pPr>
     <w:rPr>
-      <w:rFonts w:asciiTheme="majorHAnsi" w:eastAsiaTheme="majorEastAsia" w:hAnsiTheme="majorHAnsi" w:cstheme="majorBidi" w:ascii="Aptos Display" w:hAnsi="Aptos Display" w:eastAsia="Yu Gothic"/>
+      <w:rFonts w:asciiTheme="majorHAnsi" w:eastAsiaTheme="majorEastAsia" w:hAnsiTheme="majorHAnsi" w:cstheme="majorBidi" w:ascii="Yu Gothic" w:hAnsi="Yu Gothic" w:eastAsia="Yu Gothic"/>
       <w:b/>
       <w:bCs/>
-      <w:color w:val="1C6070"/>
-      <w:sz w:val="26"/>
+      <w:color w:val="0B2942"/>
+      <w:sz w:val="24"/>
       <w:szCs w:val="26"/>
     </w:rPr>
   </w:style>
@@ -1150,15 +1075,16 @@
       <w:pBdr>
         <w:bottom w:val="single" w:sz="8" w:space="4" w:color="4F81BD" w:themeColor="accent1"/>
       </w:pBdr>
-      <w:spacing w:after="300" w:line="240" w:lineRule="auto"/>
+      <w:spacing w:after="100" w:line="240" w:lineRule="auto" w:before="240"/>
       <w:contextualSpacing/>
     </w:pPr>
     <w:rPr>
-      <w:rFonts w:asciiTheme="majorHAnsi" w:eastAsiaTheme="majorEastAsia" w:hAnsiTheme="majorHAnsi" w:cstheme="majorBidi" w:ascii="Aptos Display" w:hAnsi="Aptos Display" w:eastAsia="Yu Gothic"/>
-      <w:color w:val="16334A"/>
+      <w:rFonts w:asciiTheme="majorHAnsi" w:eastAsiaTheme="majorEastAsia" w:hAnsiTheme="majorHAnsi" w:cstheme="majorBidi" w:ascii="Yu Gothic" w:hAnsi="Yu Gothic" w:eastAsia="Yu Gothic"/>
+      <w:b/>
+      <w:color w:val="0B2942"/>
       <w:spacing w:val="5"/>
       <w:kern w:val="28"/>
-      <w:sz w:val="48"/>
+      <w:sz w:val="56"/>
       <w:szCs w:val="52"/>
     </w:rPr>
   </w:style>
@@ -1332,11 +1258,12 @@
       <w:numPr>
         <w:numId w:val="1"/>
       </w:numPr>
+      <w:spacing w:after="60"/>
       <w:contextualSpacing/>
     </w:pPr>
     <w:rPr>
-      <w:rFonts w:ascii="Aptos" w:hAnsi="Aptos" w:eastAsia="Yu Gothic"/>
-      <w:sz w:val="20"/>
+      <w:rFonts w:ascii="Yu Gothic" w:hAnsi="Yu Gothic" w:eastAsia="Yu Gothic"/>
+      <w:sz w:val="21"/>
     </w:rPr>
   </w:style>
   <w:style w:type="paragraph" w:styleId="ListBullet2">

</xml_diff>